<commit_message>
Split Reto 2 into separate email source and fillable plantilla downloads.
Co-authored-by: Cursor <cursoragent@cursor.com>
</commit_message>
<xml_diff>
--- a/planillas/MCP365_P02_Formato_cadena_correos.docx
+++ b/planillas/MCP365_P02_Formato_cadena_correos.docx
@@ -25,7 +25,7 @@
                 <w:color w:val="FFEC00"/>
                 <w:sz w:val="32"/>
               </w:rPr>
-              <w:t>Formato adjunto · Cadena de correos · ST-Urb-03</w:t>
+              <w:t>Plantilla de llenado · Cadena de correos · ST-Urb-03</w:t>
             </w:r>
           </w:p>
           <w:p>
@@ -103,7 +103,7 @@
                 <w:color w:val="221E40"/>
                 <w:sz w:val="18"/>
               </w:rPr>
-              <w:t>Word + Copilot</w:t>
+              <w:t>Word + Copilot · Llenar</w:t>
             </w:r>
           </w:p>
         </w:tc>
@@ -361,7 +361,7 @@
                 <w:color w:val="221E40"/>
                 <w:sz w:val="20"/>
               </w:rPr>
-              <w:t>Word + Copilot (fuente en este documento)</w:t>
+              <w:t>Word + Copilot</w:t>
             </w:r>
           </w:p>
         </w:tc>
@@ -386,6 +386,55 @@
                 <w:color w:val="221E40"/>
                 <w:sz w:val="20"/>
               </w:rPr>
+              <w:t>Fuente usada</w:t>
+            </w:r>
+          </w:p>
+        </w:tc>
+        <w:tc>
+          <w:tcPr>
+            <w:tcW w:type="dxa" w:w="6803"/>
+            <w:tcMar>
+              <w:top w:w="80" w:type="dxa"/>
+              <w:left w:w="80" w:type="dxa"/>
+              <w:bottom w:w="80" w:type="dxa"/>
+              <w:right w:w="80" w:type="dxa"/>
+            </w:tcMar>
+          </w:tcPr>
+          <w:p>
+            <w:r/>
+            <w:r>
+              <w:rPr>
+                <w:rFonts w:ascii="Calibri" w:hAnsi="Calibri" w:eastAsia="Calibri"/>
+                <w:b w:val="0"/>
+                <w:color w:val="221E40"/>
+                <w:sz w:val="20"/>
+              </w:rPr>
+              <w:t>MCP365_P02_Fuente_correos_ST-Urb-03.docx</w:t>
+            </w:r>
+          </w:p>
+        </w:tc>
+      </w:tr>
+      <w:tr>
+        <w:tc>
+          <w:tcPr>
+            <w:tcW w:type="dxa" w:w="2268"/>
+            <w:shd w:fill="F4F3F9" w:val="clear"/>
+            <w:tcMar>
+              <w:top w:w="80" w:type="dxa"/>
+              <w:left w:w="80" w:type="dxa"/>
+              <w:bottom w:w="80" w:type="dxa"/>
+              <w:right w:w="80" w:type="dxa"/>
+            </w:tcMar>
+          </w:tcPr>
+          <w:p>
+            <w:r/>
+            <w:r>
+              <w:rPr>
+                <w:rFonts w:ascii="Calibri" w:hAnsi="Calibri" w:eastAsia="Calibri"/>
+                <w:b w:val="0"/>
+                <w:color w:val="221E40"/>
+                <w:sz w:val="20"/>
+              </w:rPr>
               <w:t>Estado</w:t>
             </w:r>
           </w:p>
@@ -393,6 +442,7 @@
         <w:tc>
           <w:tcPr>
             <w:tcW w:type="dxa" w:w="6803"/>
+            <w:shd w:fill="F4F3F9" w:val="clear"/>
             <w:tcMar>
               <w:top w:w="80" w:type="dxa"/>
               <w:left w:w="80" w:type="dxa"/>
@@ -439,7 +489,7 @@
                 <w:color w:val="221E40"/>
                 <w:sz w:val="20"/>
               </w:rPr>
-              <w:t>Fuente obligatoria:</w:t>
+              <w:t>Archivos del reto:</w:t>
             </w:r>
             <w:r>
               <w:rPr>
@@ -448,7 +498,7 @@
                 <w:color w:val="221E40"/>
                 <w:sz w:val="20"/>
               </w:rPr>
-              <w:t xml:space="preserve"> La sección 1 contiene los 4 correos del caso (De, Para, Asunto, Fecha y cuerpo). Copilot debe analizar ESA sección. No inventes mensajes. No uses solo Outlook: Word Copilot no ve tu bandeja.</w:t>
+              <w:t xml:space="preserve"> 1) MCP365_P02_Fuente_correos_ST-Urb-03.docx = correos (De/Para/Asunto). 2) ESTE archivo = plantilla de llenado. Abre ambos en Word. Copilot debe leer la fuente y completar SOLO las celdas/cuadros vacíos de esta plantilla.</w:t>
             </w:r>
           </w:p>
         </w:tc>
@@ -478,7 +528,7 @@
                 <w:color w:val="221E40"/>
                 <w:sz w:val="20"/>
               </w:rPr>
-              <w:t>Cómo usarla:</w:t>
+              <w:t>Para Copilot:</w:t>
             </w:r>
             <w:r>
               <w:rPr>
@@ -487,7 +537,7 @@
                 <w:color w:val="221E40"/>
                 <w:sz w:val="20"/>
               </w:rPr>
-              <w:t xml:space="preserve"> 1) Descarga este .docx · 2) Ábrelo en Word · 3) Abre Copilot SOBRE ESTE archivo · 4) Pega el prompt del Reto 2 · 5) Completa solo secciones 2–6 · 6) No reescribas la sección 1 · 7) Guarda como MCP365_P02_Cadena_correos_completado.docx · 8) Validación humana y control de calidad: solo la persona.</w:t>
+              <w:t xml:space="preserve"> No recrees el documento. No cambies títulos, tablas, colores ni diseño. No completes Validación humana ni Control de calidad. Si falta un dato en la fuente: escribe «No especificado».</w:t>
             </w:r>
           </w:p>
         </w:tc>
@@ -517,7 +567,7 @@
                 <w:color w:val="221E40"/>
                 <w:sz w:val="20"/>
               </w:rPr>
-              <w:t>Regla De / Asunto:</w:t>
+              <w:t>Entrega:</w:t>
             </w:r>
             <w:r>
               <w:rPr>
@@ -526,7 +576,7 @@
                 <w:color w:val="221E40"/>
                 <w:sz w:val="20"/>
               </w:rPr>
-              <w:t xml:space="preserve"> En cronología y evidencias cita siempre: fecha + De (remitente) + Asunto. Ejemplo: «04/03/2026 · Julián Pardo · RE: adelanto de repuestos · ST-Urb-03».</w:t>
+              <w:t xml:space="preserve"> Guarda ESTE archivo (ya lleno) como MCP365_P02_Cadena_correos_completado.docx.</w:t>
             </w:r>
           </w:p>
         </w:tc>
@@ -547,988 +597,7 @@
           <w:color w:val="4A3DA6"/>
           <w:sz w:val="26"/>
         </w:rPr>
-        <w:t>1. Correos fuente ST-Urb-03 · NO EDITAR (solo lectura para Copilot)</w:t>
-      </w:r>
-    </w:p>
-    <w:p>
-      <w:pPr>
-        <w:spacing w:after="160" w:before="0"/>
-      </w:pPr>
-      <w:r>
-        <w:rPr>
-          <w:rFonts w:ascii="Calibri" w:hAnsi="Calibri" w:eastAsia="Calibri"/>
-          <w:b w:val="0"/>
-          <w:color w:val="5A5A72"/>
-          <w:sz w:val="20"/>
-        </w:rPr>
-        <w:t>Cadena operativa del transformador auxiliar ST-Urb-03. Identifica cada mensaje por De, Para, Asunto y Fecha.</w:t>
-      </w:r>
-    </w:p>
-    <w:tbl>
-      <w:tblPr>
-        <w:tblW w:type="auto" w:w="0"/>
-        <w:tblLook w:firstColumn="1" w:firstRow="1" w:lastColumn="0" w:lastRow="0" w:noHBand="0" w:noVBand="1" w:val="04A0"/>
-      </w:tblPr>
-      <w:tblGrid>
-        <w:gridCol w:w="10200"/>
-      </w:tblGrid>
-      <w:tr>
-        <w:tc>
-          <w:tcPr>
-            <w:tcW w:type="dxa" w:w="10200"/>
-            <w:shd w:fill="F7F9FC" w:val="clear"/>
-          </w:tcPr>
-          <w:p>
-            <w:r/>
-            <w:r>
-              <w:rPr>
-                <w:rFonts w:ascii="Calibri" w:hAnsi="Calibri" w:eastAsia="Calibri"/>
-                <w:b/>
-                <w:color w:val="221E40"/>
-                <w:sz w:val="22"/>
-              </w:rPr>
-              <w:t>Correo 1 · 01/03/2026</w:t>
-            </w:r>
-          </w:p>
-          <w:p>
-            <w:r>
-              <w:rPr>
-                <w:rFonts w:ascii="Calibri" w:hAnsi="Calibri" w:eastAsia="Calibri"/>
-                <w:b/>
-                <w:color w:val="4A3DA6"/>
-                <w:sz w:val="20"/>
-              </w:rPr>
-              <w:t xml:space="preserve">De: </w:t>
-            </w:r>
-            <w:r>
-              <w:rPr>
-                <w:rFonts w:ascii="Calibri" w:hAnsi="Calibri" w:eastAsia="Calibri"/>
-                <w:b w:val="0"/>
-                <w:color w:val="221E40"/>
-                <w:sz w:val="20"/>
-              </w:rPr>
-              <w:t>Martha Ríos · Planeación de Mantenimiento</w:t>
-            </w:r>
-          </w:p>
-          <w:p>
-            <w:r>
-              <w:rPr>
-                <w:rFonts w:ascii="Calibri" w:hAnsi="Calibri" w:eastAsia="Calibri"/>
-                <w:b/>
-                <w:color w:val="4A3DA6"/>
-                <w:sz w:val="20"/>
-              </w:rPr>
-              <w:t xml:space="preserve">Para: </w:t>
-            </w:r>
-            <w:r>
-              <w:rPr>
-                <w:rFonts w:ascii="Calibri" w:hAnsi="Calibri" w:eastAsia="Calibri"/>
-                <w:b w:val="0"/>
-                <w:color w:val="221E40"/>
-                <w:sz w:val="20"/>
-              </w:rPr>
-              <w:t>Comunicaciones Zona; Logística de Materiales; Seguridad Industrial</w:t>
-            </w:r>
-          </w:p>
-          <w:p>
-            <w:r>
-              <w:rPr>
-                <w:rFonts w:ascii="Calibri" w:hAnsi="Calibri" w:eastAsia="Calibri"/>
-                <w:b/>
-                <w:color w:val="4A3DA6"/>
-                <w:sz w:val="20"/>
-              </w:rPr>
-              <w:t xml:space="preserve">Asunto: </w:t>
-            </w:r>
-            <w:r>
-              <w:rPr>
-                <w:rFonts w:ascii="Calibri" w:hAnsi="Calibri" w:eastAsia="Calibri"/>
-                <w:b w:val="0"/>
-                <w:color w:val="221E40"/>
-                <w:sz w:val="20"/>
-              </w:rPr>
-              <w:t>Programación transformador auxiliar ST-Urb-03</w:t>
-            </w:r>
-          </w:p>
-          <w:p>
-            <w:r>
-              <w:rPr>
-                <w:rFonts w:ascii="Calibri" w:hAnsi="Calibri" w:eastAsia="Calibri"/>
-                <w:b/>
-                <w:color w:val="4A3DA6"/>
-                <w:sz w:val="20"/>
-              </w:rPr>
-              <w:t xml:space="preserve">Fecha: </w:t>
-            </w:r>
-            <w:r>
-              <w:rPr>
-                <w:rFonts w:ascii="Calibri" w:hAnsi="Calibri" w:eastAsia="Calibri"/>
-                <w:b w:val="0"/>
-                <w:color w:val="221E40"/>
-                <w:sz w:val="20"/>
-              </w:rPr>
-              <w:t>01/03/2026</w:t>
-            </w:r>
-          </w:p>
-          <w:p/>
-          <w:p>
-            <w:r>
-              <w:rPr>
-                <w:rFonts w:ascii="Calibri" w:hAnsi="Calibri" w:eastAsia="Calibri"/>
-                <w:b w:val="0"/>
-                <w:color w:val="221E40"/>
-                <w:sz w:val="20"/>
-              </w:rPr>
-              <w:t>Buenos días,</w:t>
-            </w:r>
-          </w:p>
-          <w:p>
-            <w:r>
-              <w:rPr>
-                <w:rFonts w:ascii="Calibri" w:hAnsi="Calibri" w:eastAsia="Calibri"/>
-                <w:b w:val="0"/>
-                <w:color w:val="221E40"/>
-                <w:sz w:val="20"/>
-              </w:rPr>
-              <w:t xml:space="preserve"> </w:t>
-            </w:r>
-          </w:p>
-          <w:p>
-            <w:r>
-              <w:rPr>
-                <w:rFonts w:ascii="Calibri" w:hAnsi="Calibri" w:eastAsia="Calibri"/>
-                <w:b w:val="0"/>
-                <w:color w:val="221E40"/>
-                <w:sz w:val="20"/>
-              </w:rPr>
-              <w:t>Se confirma el mantenimiento del transformador auxiliar de la subestación ST-Urb-03 para el 12/03/2026, en la ventana 08:00–14:00.</w:t>
-            </w:r>
-          </w:p>
-          <w:p>
-            <w:r>
-              <w:rPr>
-                <w:rFonts w:ascii="Calibri" w:hAnsi="Calibri" w:eastAsia="Calibri"/>
-                <w:b w:val="0"/>
-                <w:color w:val="221E40"/>
-                <w:sz w:val="20"/>
-              </w:rPr>
-              <w:t xml:space="preserve"> </w:t>
-            </w:r>
-          </w:p>
-          <w:p>
-            <w:r>
-              <w:rPr>
-                <w:rFonts w:ascii="Calibri" w:hAnsi="Calibri" w:eastAsia="Calibri"/>
-                <w:b w:val="0"/>
-                <w:color w:val="221E40"/>
-                <w:sz w:val="20"/>
-              </w:rPr>
-              <w:t>Compromiso operativo: notificar a usuarios con mínimo 72 horas de anticipación.</w:t>
-            </w:r>
-          </w:p>
-          <w:p>
-            <w:r>
-              <w:rPr>
-                <w:rFonts w:ascii="Calibri" w:hAnsi="Calibri" w:eastAsia="Calibri"/>
-                <w:b w:val="0"/>
-                <w:color w:val="221E40"/>
-                <w:sz w:val="20"/>
-              </w:rPr>
-              <w:t>Responsable del aviso: Comunicaciones Zona.</w:t>
-            </w:r>
-          </w:p>
-          <w:p>
-            <w:r>
-              <w:rPr>
-                <w:rFonts w:ascii="Calibri" w:hAnsi="Calibri" w:eastAsia="Calibri"/>
-                <w:b w:val="0"/>
-                <w:color w:val="221E40"/>
-                <w:sz w:val="20"/>
-              </w:rPr>
-              <w:t xml:space="preserve"> </w:t>
-            </w:r>
-          </w:p>
-          <w:p>
-            <w:r>
-              <w:rPr>
-                <w:rFonts w:ascii="Calibri" w:hAnsi="Calibri" w:eastAsia="Calibri"/>
-                <w:b w:val="0"/>
-                <w:color w:val="221E40"/>
-                <w:sz w:val="20"/>
-              </w:rPr>
-              <w:t>Quedo pendiente de cualquier novedad de agenda.</w:t>
-            </w:r>
-          </w:p>
-          <w:p>
-            <w:r>
-              <w:rPr>
-                <w:rFonts w:ascii="Calibri" w:hAnsi="Calibri" w:eastAsia="Calibri"/>
-                <w:b w:val="0"/>
-                <w:color w:val="221E40"/>
-                <w:sz w:val="20"/>
-              </w:rPr>
-              <w:t xml:space="preserve"> </w:t>
-            </w:r>
-          </w:p>
-          <w:p>
-            <w:r>
-              <w:rPr>
-                <w:rFonts w:ascii="Calibri" w:hAnsi="Calibri" w:eastAsia="Calibri"/>
-                <w:b w:val="0"/>
-                <w:color w:val="221E40"/>
-                <w:sz w:val="20"/>
-              </w:rPr>
-              <w:t>Martha Ríos</w:t>
-            </w:r>
-          </w:p>
-          <w:p>
-            <w:r>
-              <w:rPr>
-                <w:rFonts w:ascii="Calibri" w:hAnsi="Calibri" w:eastAsia="Calibri"/>
-                <w:b w:val="0"/>
-                <w:color w:val="221E40"/>
-                <w:sz w:val="20"/>
-              </w:rPr>
-              <w:t>Planeación de Mantenimiento · Zona Norte</w:t>
-            </w:r>
-          </w:p>
-        </w:tc>
-      </w:tr>
-    </w:tbl>
-    <w:p/>
-    <w:tbl>
-      <w:tblPr>
-        <w:tblW w:type="auto" w:w="0"/>
-        <w:tblLook w:firstColumn="1" w:firstRow="1" w:lastColumn="0" w:lastRow="0" w:noHBand="0" w:noVBand="1" w:val="04A0"/>
-      </w:tblPr>
-      <w:tblGrid>
-        <w:gridCol w:w="10200"/>
-      </w:tblGrid>
-      <w:tr>
-        <w:tc>
-          <w:tcPr>
-            <w:tcW w:type="dxa" w:w="10200"/>
-            <w:shd w:fill="F7F9FC" w:val="clear"/>
-          </w:tcPr>
-          <w:p>
-            <w:r/>
-            <w:r>
-              <w:rPr>
-                <w:rFonts w:ascii="Calibri" w:hAnsi="Calibri" w:eastAsia="Calibri"/>
-                <w:b/>
-                <w:color w:val="221E40"/>
-                <w:sz w:val="22"/>
-              </w:rPr>
-              <w:t>Correo 2 · 04/03/2026</w:t>
-            </w:r>
-          </w:p>
-          <w:p>
-            <w:r>
-              <w:rPr>
-                <w:rFonts w:ascii="Calibri" w:hAnsi="Calibri" w:eastAsia="Calibri"/>
-                <w:b/>
-                <w:color w:val="4A3DA6"/>
-                <w:sz w:val="20"/>
-              </w:rPr>
-              <w:t xml:space="preserve">De: </w:t>
-            </w:r>
-            <w:r>
-              <w:rPr>
-                <w:rFonts w:ascii="Calibri" w:hAnsi="Calibri" w:eastAsia="Calibri"/>
-                <w:b w:val="0"/>
-                <w:color w:val="221E40"/>
-                <w:sz w:val="20"/>
-              </w:rPr>
-              <w:t>Julián Pardo · Logística de Materiales</w:t>
-            </w:r>
-          </w:p>
-          <w:p>
-            <w:r>
-              <w:rPr>
-                <w:rFonts w:ascii="Calibri" w:hAnsi="Calibri" w:eastAsia="Calibri"/>
-                <w:b/>
-                <w:color w:val="4A3DA6"/>
-                <w:sz w:val="20"/>
-              </w:rPr>
-              <w:t xml:space="preserve">Para: </w:t>
-            </w:r>
-            <w:r>
-              <w:rPr>
-                <w:rFonts w:ascii="Calibri" w:hAnsi="Calibri" w:eastAsia="Calibri"/>
-                <w:b w:val="0"/>
-                <w:color w:val="221E40"/>
-                <w:sz w:val="20"/>
-              </w:rPr>
-              <w:t>Planeación de Mantenimiento; Comunicaciones Zona; Seguridad Industrial</w:t>
-            </w:r>
-          </w:p>
-          <w:p>
-            <w:r>
-              <w:rPr>
-                <w:rFonts w:ascii="Calibri" w:hAnsi="Calibri" w:eastAsia="Calibri"/>
-                <w:b/>
-                <w:color w:val="4A3DA6"/>
-                <w:sz w:val="20"/>
-              </w:rPr>
-              <w:t xml:space="preserve">Asunto: </w:t>
-            </w:r>
-            <w:r>
-              <w:rPr>
-                <w:rFonts w:ascii="Calibri" w:hAnsi="Calibri" w:eastAsia="Calibri"/>
-                <w:b w:val="0"/>
-                <w:color w:val="221E40"/>
-                <w:sz w:val="20"/>
-              </w:rPr>
-              <w:t>RE: adelanto de repuestos · ST-Urb-03</w:t>
-            </w:r>
-          </w:p>
-          <w:p>
-            <w:r>
-              <w:rPr>
-                <w:rFonts w:ascii="Calibri" w:hAnsi="Calibri" w:eastAsia="Calibri"/>
-                <w:b/>
-                <w:color w:val="4A3DA6"/>
-                <w:sz w:val="20"/>
-              </w:rPr>
-              <w:t xml:space="preserve">Fecha: </w:t>
-            </w:r>
-            <w:r>
-              <w:rPr>
-                <w:rFonts w:ascii="Calibri" w:hAnsi="Calibri" w:eastAsia="Calibri"/>
-                <w:b w:val="0"/>
-                <w:color w:val="221E40"/>
-                <w:sz w:val="20"/>
-              </w:rPr>
-              <w:t>04/03/2026</w:t>
-            </w:r>
-          </w:p>
-          <w:p/>
-          <w:p>
-            <w:r>
-              <w:rPr>
-                <w:rFonts w:ascii="Calibri" w:hAnsi="Calibri" w:eastAsia="Calibri"/>
-                <w:b w:val="0"/>
-                <w:color w:val="221E40"/>
-                <w:sz w:val="20"/>
-              </w:rPr>
-              <w:t>Buenos días,</w:t>
-            </w:r>
-          </w:p>
-          <w:p>
-            <w:r>
-              <w:rPr>
-                <w:rFonts w:ascii="Calibri" w:hAnsi="Calibri" w:eastAsia="Calibri"/>
-                <w:b w:val="0"/>
-                <w:color w:val="221E40"/>
-                <w:sz w:val="20"/>
-              </w:rPr>
-              <w:t xml:space="preserve"> </w:t>
-            </w:r>
-          </w:p>
-          <w:p>
-            <w:r>
-              <w:rPr>
-                <w:rFonts w:ascii="Calibri" w:hAnsi="Calibri" w:eastAsia="Calibri"/>
-                <w:b w:val="0"/>
-                <w:color w:val="221E40"/>
-                <w:sz w:val="20"/>
-              </w:rPr>
-              <w:t>El proveedor confirma entrega anticipada de los repuestos del transformador auxiliar.</w:t>
-            </w:r>
-          </w:p>
-          <w:p>
-            <w:r>
-              <w:rPr>
-                <w:rFonts w:ascii="Calibri" w:hAnsi="Calibri" w:eastAsia="Calibri"/>
-                <w:b w:val="0"/>
-                <w:color w:val="221E40"/>
-                <w:sz w:val="20"/>
-              </w:rPr>
-              <w:t>Con ese adelanto, proponemos mover la ventana de intervención al 10/03/2026 (misma franja preliminar 08:00–14:00).</w:t>
-            </w:r>
-          </w:p>
-          <w:p>
-            <w:r>
-              <w:rPr>
-                <w:rFonts w:ascii="Calibri" w:hAnsi="Calibri" w:eastAsia="Calibri"/>
-                <w:b w:val="0"/>
-                <w:color w:val="221E40"/>
-                <w:sz w:val="20"/>
-              </w:rPr>
-              <w:t xml:space="preserve"> </w:t>
-            </w:r>
-          </w:p>
-          <w:p>
-            <w:r>
-              <w:rPr>
-                <w:rFonts w:ascii="Calibri" w:hAnsi="Calibri" w:eastAsia="Calibri"/>
-                <w:b w:val="0"/>
-                <w:color w:val="221E40"/>
-                <w:sz w:val="20"/>
-              </w:rPr>
-              <w:t>Pendiente: validar disponibilidad de personal de seguridad industrial para esa fecha antes de comunicar el cambio a la comunidad.</w:t>
-            </w:r>
-          </w:p>
-          <w:p>
-            <w:r>
-              <w:rPr>
-                <w:rFonts w:ascii="Calibri" w:hAnsi="Calibri" w:eastAsia="Calibri"/>
-                <w:b w:val="0"/>
-                <w:color w:val="221E40"/>
-                <w:sz w:val="20"/>
-              </w:rPr>
-              <w:t xml:space="preserve"> </w:t>
-            </w:r>
-          </w:p>
-          <w:p>
-            <w:r>
-              <w:rPr>
-                <w:rFonts w:ascii="Calibri" w:hAnsi="Calibri" w:eastAsia="Calibri"/>
-                <w:b w:val="0"/>
-                <w:color w:val="221E40"/>
-                <w:sz w:val="20"/>
-              </w:rPr>
-              <w:t>Gracias.</w:t>
-            </w:r>
-          </w:p>
-          <w:p>
-            <w:r>
-              <w:rPr>
-                <w:rFonts w:ascii="Calibri" w:hAnsi="Calibri" w:eastAsia="Calibri"/>
-                <w:b w:val="0"/>
-                <w:color w:val="221E40"/>
-                <w:sz w:val="20"/>
-              </w:rPr>
-              <w:t xml:space="preserve"> </w:t>
-            </w:r>
-          </w:p>
-          <w:p>
-            <w:r>
-              <w:rPr>
-                <w:rFonts w:ascii="Calibri" w:hAnsi="Calibri" w:eastAsia="Calibri"/>
-                <w:b w:val="0"/>
-                <w:color w:val="221E40"/>
-                <w:sz w:val="20"/>
-              </w:rPr>
-              <w:t>Julián Pardo</w:t>
-            </w:r>
-          </w:p>
-          <w:p>
-            <w:r>
-              <w:rPr>
-                <w:rFonts w:ascii="Calibri" w:hAnsi="Calibri" w:eastAsia="Calibri"/>
-                <w:b w:val="0"/>
-                <w:color w:val="221E40"/>
-                <w:sz w:val="20"/>
-              </w:rPr>
-              <w:t>Logística de Materiales</w:t>
-            </w:r>
-          </w:p>
-        </w:tc>
-      </w:tr>
-    </w:tbl>
-    <w:p/>
-    <w:tbl>
-      <w:tblPr>
-        <w:tblW w:type="auto" w:w="0"/>
-        <w:tblLook w:firstColumn="1" w:firstRow="1" w:lastColumn="0" w:lastRow="0" w:noHBand="0" w:noVBand="1" w:val="04A0"/>
-      </w:tblPr>
-      <w:tblGrid>
-        <w:gridCol w:w="10200"/>
-      </w:tblGrid>
-      <w:tr>
-        <w:tc>
-          <w:tcPr>
-            <w:tcW w:type="dxa" w:w="10200"/>
-            <w:shd w:fill="F7F9FC" w:val="clear"/>
-          </w:tcPr>
-          <w:p>
-            <w:r/>
-            <w:r>
-              <w:rPr>
-                <w:rFonts w:ascii="Calibri" w:hAnsi="Calibri" w:eastAsia="Calibri"/>
-                <w:b/>
-                <w:color w:val="221E40"/>
-                <w:sz w:val="22"/>
-              </w:rPr>
-              <w:t>Correo 3 · 06/03/2026</w:t>
-            </w:r>
-          </w:p>
-          <w:p>
-            <w:r>
-              <w:rPr>
-                <w:rFonts w:ascii="Calibri" w:hAnsi="Calibri" w:eastAsia="Calibri"/>
-                <w:b/>
-                <w:color w:val="4A3DA6"/>
-                <w:sz w:val="20"/>
-              </w:rPr>
-              <w:t xml:space="preserve">De: </w:t>
-            </w:r>
-            <w:r>
-              <w:rPr>
-                <w:rFonts w:ascii="Calibri" w:hAnsi="Calibri" w:eastAsia="Calibri"/>
-                <w:b w:val="0"/>
-                <w:color w:val="221E40"/>
-                <w:sz w:val="20"/>
-              </w:rPr>
-              <w:t>Carolina Vélez · Seguridad Industrial</w:t>
-            </w:r>
-          </w:p>
-          <w:p>
-            <w:r>
-              <w:rPr>
-                <w:rFonts w:ascii="Calibri" w:hAnsi="Calibri" w:eastAsia="Calibri"/>
-                <w:b/>
-                <w:color w:val="4A3DA6"/>
-                <w:sz w:val="20"/>
-              </w:rPr>
-              <w:t xml:space="preserve">Para: </w:t>
-            </w:r>
-            <w:r>
-              <w:rPr>
-                <w:rFonts w:ascii="Calibri" w:hAnsi="Calibri" w:eastAsia="Calibri"/>
-                <w:b w:val="0"/>
-                <w:color w:val="221E40"/>
-                <w:sz w:val="20"/>
-              </w:rPr>
-              <w:t>Logística de Materiales; Planeación de Mantenimiento; Comunicaciones Zona</w:t>
-            </w:r>
-          </w:p>
-          <w:p>
-            <w:r>
-              <w:rPr>
-                <w:rFonts w:ascii="Calibri" w:hAnsi="Calibri" w:eastAsia="Calibri"/>
-                <w:b/>
-                <w:color w:val="4A3DA6"/>
-                <w:sz w:val="20"/>
-              </w:rPr>
-              <w:t xml:space="preserve">Asunto: </w:t>
-            </w:r>
-            <w:r>
-              <w:rPr>
-                <w:rFonts w:ascii="Calibri" w:hAnsi="Calibri" w:eastAsia="Calibri"/>
-                <w:b w:val="0"/>
-                <w:color w:val="221E40"/>
-                <w:sz w:val="20"/>
-              </w:rPr>
-              <w:t>RE: personal 10/03 · ST-Urb-03</w:t>
-            </w:r>
-          </w:p>
-          <w:p>
-            <w:r>
-              <w:rPr>
-                <w:rFonts w:ascii="Calibri" w:hAnsi="Calibri" w:eastAsia="Calibri"/>
-                <w:b/>
-                <w:color w:val="4A3DA6"/>
-                <w:sz w:val="20"/>
-              </w:rPr>
-              <w:t xml:space="preserve">Fecha: </w:t>
-            </w:r>
-            <w:r>
-              <w:rPr>
-                <w:rFonts w:ascii="Calibri" w:hAnsi="Calibri" w:eastAsia="Calibri"/>
-                <w:b w:val="0"/>
-                <w:color w:val="221E40"/>
-                <w:sz w:val="20"/>
-              </w:rPr>
-              <w:t>06/03/2026</w:t>
-            </w:r>
-          </w:p>
-          <w:p/>
-          <w:p>
-            <w:r>
-              <w:rPr>
-                <w:rFonts w:ascii="Calibri" w:hAnsi="Calibri" w:eastAsia="Calibri"/>
-                <w:b w:val="0"/>
-                <w:color w:val="221E40"/>
-                <w:sz w:val="20"/>
-              </w:rPr>
-              <w:t>Buenos días,</w:t>
-            </w:r>
-          </w:p>
-          <w:p>
-            <w:r>
-              <w:rPr>
-                <w:rFonts w:ascii="Calibri" w:hAnsi="Calibri" w:eastAsia="Calibri"/>
-                <w:b w:val="0"/>
-                <w:color w:val="221E40"/>
-                <w:sz w:val="20"/>
-              </w:rPr>
-              <w:t xml:space="preserve"> </w:t>
-            </w:r>
-          </w:p>
-          <w:p>
-            <w:r>
-              <w:rPr>
-                <w:rFonts w:ascii="Calibri" w:hAnsi="Calibri" w:eastAsia="Calibri"/>
-                <w:b w:val="0"/>
-                <w:color w:val="221E40"/>
-                <w:sz w:val="20"/>
-              </w:rPr>
-              <w:t>Confirmamos personal de seguridad industrial para el 10/03/2026.</w:t>
-            </w:r>
-          </w:p>
-          <w:p>
-            <w:r>
-              <w:rPr>
-                <w:rFonts w:ascii="Calibri" w:hAnsi="Calibri" w:eastAsia="Calibri"/>
-                <w:b w:val="0"/>
-                <w:color w:val="221E40"/>
-                <w:sz w:val="20"/>
-              </w:rPr>
-              <w:t>Solicitamos ampliar el cierre de área hasta las 16:00 para cubrir el retiro de equipos y la inspección final.</w:t>
-            </w:r>
-          </w:p>
-          <w:p>
-            <w:r>
-              <w:rPr>
-                <w:rFonts w:ascii="Calibri" w:hAnsi="Calibri" w:eastAsia="Calibri"/>
-                <w:b w:val="0"/>
-                <w:color w:val="221E40"/>
-                <w:sz w:val="20"/>
-              </w:rPr>
-              <w:t xml:space="preserve"> </w:t>
-            </w:r>
-          </w:p>
-          <w:p>
-            <w:r>
-              <w:rPr>
-                <w:rFonts w:ascii="Calibri" w:hAnsi="Calibri" w:eastAsia="Calibri"/>
-                <w:b w:val="0"/>
-                <w:color w:val="221E40"/>
-                <w:sz w:val="20"/>
-              </w:rPr>
-              <w:t>Riesgo señalado: señalización insuficiente si no se refuerza el perímetro antes de las 07:30.</w:t>
-            </w:r>
-          </w:p>
-          <w:p>
-            <w:r>
-              <w:rPr>
-                <w:rFonts w:ascii="Calibri" w:hAnsi="Calibri" w:eastAsia="Calibri"/>
-                <w:b w:val="0"/>
-                <w:color w:val="221E40"/>
-                <w:sz w:val="20"/>
-              </w:rPr>
-              <w:t>Agradecemos coordinación con Comunicaciones Zona para el aviso a vecinos.</w:t>
-            </w:r>
-          </w:p>
-          <w:p>
-            <w:r>
-              <w:rPr>
-                <w:rFonts w:ascii="Calibri" w:hAnsi="Calibri" w:eastAsia="Calibri"/>
-                <w:b w:val="0"/>
-                <w:color w:val="221E40"/>
-                <w:sz w:val="20"/>
-              </w:rPr>
-              <w:t xml:space="preserve"> </w:t>
-            </w:r>
-          </w:p>
-          <w:p>
-            <w:r>
-              <w:rPr>
-                <w:rFonts w:ascii="Calibri" w:hAnsi="Calibri" w:eastAsia="Calibri"/>
-                <w:b w:val="0"/>
-                <w:color w:val="221E40"/>
-                <w:sz w:val="20"/>
-              </w:rPr>
-              <w:t>Quedo atenta.</w:t>
-            </w:r>
-          </w:p>
-          <w:p>
-            <w:r>
-              <w:rPr>
-                <w:rFonts w:ascii="Calibri" w:hAnsi="Calibri" w:eastAsia="Calibri"/>
-                <w:b w:val="0"/>
-                <w:color w:val="221E40"/>
-                <w:sz w:val="20"/>
-              </w:rPr>
-              <w:t xml:space="preserve"> </w:t>
-            </w:r>
-          </w:p>
-          <w:p>
-            <w:r>
-              <w:rPr>
-                <w:rFonts w:ascii="Calibri" w:hAnsi="Calibri" w:eastAsia="Calibri"/>
-                <w:b w:val="0"/>
-                <w:color w:val="221E40"/>
-                <w:sz w:val="20"/>
-              </w:rPr>
-              <w:t>Carolina Vélez</w:t>
-            </w:r>
-          </w:p>
-          <w:p>
-            <w:r>
-              <w:rPr>
-                <w:rFonts w:ascii="Calibri" w:hAnsi="Calibri" w:eastAsia="Calibri"/>
-                <w:b w:val="0"/>
-                <w:color w:val="221E40"/>
-                <w:sz w:val="20"/>
-              </w:rPr>
-              <w:t>Seguridad Industrial · Zona Norte</w:t>
-            </w:r>
-          </w:p>
-        </w:tc>
-      </w:tr>
-    </w:tbl>
-    <w:p/>
-    <w:tbl>
-      <w:tblPr>
-        <w:tblW w:type="auto" w:w="0"/>
-        <w:tblLook w:firstColumn="1" w:firstRow="1" w:lastColumn="0" w:lastRow="0" w:noHBand="0" w:noVBand="1" w:val="04A0"/>
-      </w:tblPr>
-      <w:tblGrid>
-        <w:gridCol w:w="10200"/>
-      </w:tblGrid>
-      <w:tr>
-        <w:tc>
-          <w:tcPr>
-            <w:tcW w:type="dxa" w:w="10200"/>
-            <w:shd w:fill="F7F9FC" w:val="clear"/>
-          </w:tcPr>
-          <w:p>
-            <w:r/>
-            <w:r>
-              <w:rPr>
-                <w:rFonts w:ascii="Calibri" w:hAnsi="Calibri" w:eastAsia="Calibri"/>
-                <w:b/>
-                <w:color w:val="221E40"/>
-                <w:sz w:val="22"/>
-              </w:rPr>
-              <w:t>Correo 4 · 07/03/2026</w:t>
-            </w:r>
-          </w:p>
-          <w:p>
-            <w:r>
-              <w:rPr>
-                <w:rFonts w:ascii="Calibri" w:hAnsi="Calibri" w:eastAsia="Calibri"/>
-                <w:b/>
-                <w:color w:val="4A3DA6"/>
-                <w:sz w:val="20"/>
-              </w:rPr>
-              <w:t xml:space="preserve">De: </w:t>
-            </w:r>
-            <w:r>
-              <w:rPr>
-                <w:rFonts w:ascii="Calibri" w:hAnsi="Calibri" w:eastAsia="Calibri"/>
-                <w:b w:val="0"/>
-                <w:color w:val="221E40"/>
-                <w:sz w:val="20"/>
-              </w:rPr>
-              <w:t>Diego Castaño · Gerencia de Zona Norte</w:t>
-            </w:r>
-          </w:p>
-          <w:p>
-            <w:r>
-              <w:rPr>
-                <w:rFonts w:ascii="Calibri" w:hAnsi="Calibri" w:eastAsia="Calibri"/>
-                <w:b/>
-                <w:color w:val="4A3DA6"/>
-                <w:sz w:val="20"/>
-              </w:rPr>
-              <w:t xml:space="preserve">Para: </w:t>
-            </w:r>
-            <w:r>
-              <w:rPr>
-                <w:rFonts w:ascii="Calibri" w:hAnsi="Calibri" w:eastAsia="Calibri"/>
-                <w:b w:val="0"/>
-                <w:color w:val="221E40"/>
-                <w:sz w:val="20"/>
-              </w:rPr>
-              <w:t>Comunicaciones Zona; Planeación de Mantenimiento; Seguridad Industrial; Logística de Materiales</w:t>
-            </w:r>
-          </w:p>
-          <w:p>
-            <w:r>
-              <w:rPr>
-                <w:rFonts w:ascii="Calibri" w:hAnsi="Calibri" w:eastAsia="Calibri"/>
-                <w:b/>
-                <w:color w:val="4A3DA6"/>
-                <w:sz w:val="20"/>
-              </w:rPr>
-              <w:t xml:space="preserve">Asunto: </w:t>
-            </w:r>
-            <w:r>
-              <w:rPr>
-                <w:rFonts w:ascii="Calibri" w:hAnsi="Calibri" w:eastAsia="Calibri"/>
-                <w:b w:val="0"/>
-                <w:color w:val="221E40"/>
-                <w:sz w:val="20"/>
-              </w:rPr>
-              <w:t>Aprobación ventana 10/03 · ST-Urb-03</w:t>
-            </w:r>
-          </w:p>
-          <w:p>
-            <w:r>
-              <w:rPr>
-                <w:rFonts w:ascii="Calibri" w:hAnsi="Calibri" w:eastAsia="Calibri"/>
-                <w:b/>
-                <w:color w:val="4A3DA6"/>
-                <w:sz w:val="20"/>
-              </w:rPr>
-              <w:t xml:space="preserve">Fecha: </w:t>
-            </w:r>
-            <w:r>
-              <w:rPr>
-                <w:rFonts w:ascii="Calibri" w:hAnsi="Calibri" w:eastAsia="Calibri"/>
-                <w:b w:val="0"/>
-                <w:color w:val="221E40"/>
-                <w:sz w:val="20"/>
-              </w:rPr>
-              <w:t>07/03/2026</w:t>
-            </w:r>
-          </w:p>
-          <w:p/>
-          <w:p>
-            <w:r>
-              <w:rPr>
-                <w:rFonts w:ascii="Calibri" w:hAnsi="Calibri" w:eastAsia="Calibri"/>
-                <w:b w:val="0"/>
-                <w:color w:val="221E40"/>
-                <w:sz w:val="20"/>
-              </w:rPr>
-              <w:t>Equipo,</w:t>
-            </w:r>
-          </w:p>
-          <w:p>
-            <w:r>
-              <w:rPr>
-                <w:rFonts w:ascii="Calibri" w:hAnsi="Calibri" w:eastAsia="Calibri"/>
-                <w:b w:val="0"/>
-                <w:color w:val="221E40"/>
-                <w:sz w:val="20"/>
-              </w:rPr>
-              <w:t xml:space="preserve"> </w:t>
-            </w:r>
-          </w:p>
-          <w:p>
-            <w:r>
-              <w:rPr>
-                <w:rFonts w:ascii="Calibri" w:hAnsi="Calibri" w:eastAsia="Calibri"/>
-                <w:b w:val="0"/>
-                <w:color w:val="221E40"/>
-                <w:sz w:val="20"/>
-              </w:rPr>
-              <w:t>Se aprueba la intervención del transformador auxiliar ST-Urb-03 el 10/03/2026 con cierre de área hasta las 16:00.</w:t>
-            </w:r>
-          </w:p>
-          <w:p>
-            <w:r>
-              <w:rPr>
-                <w:rFonts w:ascii="Calibri" w:hAnsi="Calibri" w:eastAsia="Calibri"/>
-                <w:b w:val="0"/>
-                <w:color w:val="221E40"/>
-                <w:sz w:val="20"/>
-              </w:rPr>
-              <w:t xml:space="preserve"> </w:t>
-            </w:r>
-          </w:p>
-          <w:p>
-            <w:r>
-              <w:rPr>
-                <w:rFonts w:ascii="Calibri" w:hAnsi="Calibri" w:eastAsia="Calibri"/>
-                <w:b w:val="0"/>
-                <w:color w:val="221E40"/>
-                <w:sz w:val="20"/>
-              </w:rPr>
-              <w:t>Solicito:</w:t>
-            </w:r>
-          </w:p>
-          <w:p>
-            <w:r>
-              <w:rPr>
-                <w:rFonts w:ascii="Calibri" w:hAnsi="Calibri" w:eastAsia="Calibri"/>
-                <w:b w:val="0"/>
-                <w:color w:val="221E40"/>
-                <w:sz w:val="20"/>
-              </w:rPr>
-              <w:t>1) Mensaje claro a la comunidad con al menos 72 horas de anticipación.</w:t>
-            </w:r>
-          </w:p>
-          <w:p>
-            <w:r>
-              <w:rPr>
-                <w:rFonts w:ascii="Calibri" w:hAnsi="Calibri" w:eastAsia="Calibri"/>
-                <w:b w:val="0"/>
-                <w:color w:val="221E40"/>
-                <w:sz w:val="20"/>
-              </w:rPr>
-              <w:t>2) Reporte ejecutivo al cierre de la jornada (alcance, novedades y estado final).</w:t>
-            </w:r>
-          </w:p>
-          <w:p>
-            <w:r>
-              <w:rPr>
-                <w:rFonts w:ascii="Calibri" w:hAnsi="Calibri" w:eastAsia="Calibri"/>
-                <w:b w:val="0"/>
-                <w:color w:val="221E40"/>
-                <w:sz w:val="20"/>
-              </w:rPr>
-              <w:t xml:space="preserve"> </w:t>
-            </w:r>
-          </w:p>
-          <w:p>
-            <w:r>
-              <w:rPr>
-                <w:rFonts w:ascii="Calibri" w:hAnsi="Calibri" w:eastAsia="Calibri"/>
-                <w:b w:val="0"/>
-                <w:color w:val="221E40"/>
-                <w:sz w:val="20"/>
-              </w:rPr>
-              <w:t>Favor confirmar recepción.</w:t>
-            </w:r>
-          </w:p>
-          <w:p>
-            <w:r>
-              <w:rPr>
-                <w:rFonts w:ascii="Calibri" w:hAnsi="Calibri" w:eastAsia="Calibri"/>
-                <w:b w:val="0"/>
-                <w:color w:val="221E40"/>
-                <w:sz w:val="20"/>
-              </w:rPr>
-              <w:t xml:space="preserve"> </w:t>
-            </w:r>
-          </w:p>
-          <w:p>
-            <w:r>
-              <w:rPr>
-                <w:rFonts w:ascii="Calibri" w:hAnsi="Calibri" w:eastAsia="Calibri"/>
-                <w:b w:val="0"/>
-                <w:color w:val="221E40"/>
-                <w:sz w:val="20"/>
-              </w:rPr>
-              <w:t>Diego Castaño</w:t>
-            </w:r>
-          </w:p>
-          <w:p>
-            <w:r>
-              <w:rPr>
-                <w:rFonts w:ascii="Calibri" w:hAnsi="Calibri" w:eastAsia="Calibri"/>
-                <w:b w:val="0"/>
-                <w:color w:val="221E40"/>
-                <w:sz w:val="20"/>
-              </w:rPr>
-              <w:t>Gerencia de Zona Norte</w:t>
-            </w:r>
-          </w:p>
-        </w:tc>
-      </w:tr>
-    </w:tbl>
-    <w:p/>
-    <w:p>
-      <w:pPr>
-        <w:spacing w:before="280" w:after="120"/>
-        <w:pBdr>
-          <w:bottom w:val="single" w:sz="12" w:space="4" w:color="4A3DA6"/>
-        </w:pBdr>
-      </w:pPr>
-      <w:r>
-        <w:rPr>
-          <w:rFonts w:ascii="Calibri" w:hAnsi="Calibri" w:eastAsia="Calibri"/>
-          <w:b/>
-          <w:color w:val="4A3DA6"/>
-          <w:sz w:val="26"/>
-        </w:rPr>
-        <w:t>2. Cronología de la cadena · LLENAR CON COPILOT</w:t>
+        <w:t>1. Cronología de la cadena · LLENAR CON COPILOT</w:t>
       </w:r>
     </w:p>
     <w:p>
@@ -1542,7 +611,7 @@
           <w:color w:val="5A5A72"/>
           <w:sz w:val="18"/>
         </w:rPr>
-        <w:t>Una fila por correo. En «Evidencia» cita De + Asunto + fragmento textual.</w:t>
+        <w:t>Una fila por correo de la fuente. En «Evidencia» cita fecha + De + Asunto + fragmento textual.</w:t>
       </w:r>
     </w:p>
     <w:tbl>
@@ -2387,7 +1456,7 @@
           <w:color w:val="4A3DA6"/>
           <w:sz w:val="26"/>
         </w:rPr>
-        <w:t>3. Cambios respecto al plan inicial · LLENAR CON COPILOT</w:t>
+        <w:t>2. Cambios respecto al plan inicial · LLENAR CON COPILOT</w:t>
       </w:r>
     </w:p>
     <w:tbl>
@@ -3006,7 +2075,7 @@
           <w:color w:val="4A3DA6"/>
           <w:sz w:val="26"/>
         </w:rPr>
-        <w:t>4. Compromisos vigentes · LLENAR CON COPILOT</w:t>
+        <w:t>3. Compromisos vigentes · LLENAR CON COPILOT</w:t>
       </w:r>
     </w:p>
     <w:tbl>
@@ -3625,7 +2694,7 @@
           <w:color w:val="4A3DA6"/>
           <w:sz w:val="26"/>
         </w:rPr>
-        <w:t>5. Respuesta técnica · LLENAR CON COPILOT</w:t>
+        <w:t>4. Respuesta técnica · LLENAR CON COPILOT</w:t>
       </w:r>
     </w:p>
     <w:p>
@@ -3639,7 +2708,7 @@
           <w:color w:val="5A5A72"/>
           <w:sz w:val="18"/>
         </w:rPr>
-        <w:t>Precisión operativa: procedimiento, tiempos, controles, responsable. Solo con datos de la sección 1.</w:t>
+        <w:t>Precisión operativa: procedimiento, tiempos, controles, responsable. Solo con datos de la fuente.</w:t>
       </w:r>
     </w:p>
     <w:tbl>
@@ -3741,7 +2810,7 @@
           <w:color w:val="4A3DA6"/>
           <w:sz w:val="26"/>
         </w:rPr>
-        <w:t>6. Respuesta ejecutiva (máx. 8 líneas) · LLENAR CON COPILOT</w:t>
+        <w:t>5. Respuesta ejecutiva (máx. 8 líneas) · LLENAR CON COPILOT</w:t>
       </w:r>
     </w:p>
     <w:p>
@@ -3857,7 +2926,7 @@
           <w:color w:val="4A3DA6"/>
           <w:sz w:val="26"/>
         </w:rPr>
-        <w:t>7. Comunicación a usuarios / comunidad (máx. 6 líneas) · LLENAR CON COPILOT</w:t>
+        <w:t>6. Comunicación a usuarios / comunidad (máx. 6 líneas) · LLENAR CON COPILOT</w:t>
       </w:r>
     </w:p>
     <w:p>
@@ -3973,7 +3042,7 @@
           <w:color w:val="4A3DA6"/>
           <w:sz w:val="26"/>
         </w:rPr>
-        <w:t>8. Validación humana · SOLO LA PERSONA (no Copilot)</w:t>
+        <w:t>7. Validación humana · SOLO LA PERSONA (no Copilot)</w:t>
       </w:r>
     </w:p>
     <w:tbl>
@@ -4197,7 +3266,7 @@
           <w:color w:val="4A3DA6"/>
           <w:sz w:val="26"/>
         </w:rPr>
-        <w:t>9. Control de calidad · SOLO LA PERSONA (no Copilot)</w:t>
+        <w:t>8. Control de calidad · SOLO LA PERSONA (no Copilot)</w:t>
       </w:r>
     </w:p>
     <w:tbl>
@@ -4280,7 +3349,7 @@
                 <w:color w:val="221E40"/>
                 <w:sz w:val="20"/>
               </w:rPr>
-              <w:t>Sección 1 intacta (correos fuente no reescritos)</w:t>
+              <w:t>Diseño de la plantilla conservado (sin reconstruir)</w:t>
             </w:r>
           </w:p>
         </w:tc>

</xml_diff>